<commit_message>
docs(srs): render V1.1 implementation RC with regenerated UML and static checks
</commit_message>
<xml_diff>
--- a/docs/srs/CognitaNexus-Shared-SRS-V1.1-Implementation-RC.docx
+++ b/docs/srs/CognitaNexus-Shared-SRS-V1.1-Implementation-RC.docx
@@ -4136,7 +4136,7 @@
       <w:r>
         <w:drawing>
           <wp:inline>
-            <wp:extent cx="5334000" cy="9494627"/>
+            <wp:extent cx="3635999" cy="6479999"/>
             <wp:effectExtent b="0" l="0" r="0" t="0"/>
             <wp:docPr descr="合作路径活动图" title="" id="63" name="Picture"/>
             <a:graphic>
@@ -4166,7 +4166,7 @@
                   <pic:spPr bwMode="auto">
                     <a:xfrm>
                       <a:off x="0" y="0"/>
-                      <a:ext cx="5334000" cy="9494627"/>
+                      <a:ext cx="3635999" cy="6479999"/>
                     </a:xfrm>
                     <a:prstGeom prst="rect">
                       <a:avLst/>

</xml_diff>